<commit_message>
Harden WABA webhook mapping, state model, and idempotency/event schema
</commit_message>
<xml_diff>
--- a/masterrequirement.docx
+++ b/masterrequirement.docx
@@ -1529,6 +1529,149 @@
           <w:sz-cs w:val="24"/>
         </w:rPr>
         <w:t xml:space="preserve">- Prevents startup crash: "Cannot write DateTime with Kind=Unspecified to PostgreSQL type 'timestamp with time zone'."</w:t>
+      </w:r>
+    </w:p>
+    <w:p>
+      <w:pPr/>
+      <w:r>
+        <w:rPr>
+          <w:rFonts w:ascii="Helvetica Light" w:hAnsi="Helvetica Light" w:cs="Helvetica Light"/>
+          <w:sz w:val="24"/>
+          <w:sz-cs w:val="24"/>
+        </w:rPr>
+        <w:t xml:space="preserve"/>
+      </w:r>
+    </w:p>
+    <w:p>
+      <w:pPr/>
+      <w:r>
+        <w:rPr>
+          <w:rFonts w:ascii="Helvetica Light" w:hAnsi="Helvetica Light" w:cs="Helvetica Light"/>
+          <w:sz w:val="24"/>
+          <w:sz-cs w:val="24"/>
+        </w:rPr>
+        <w:t xml:space="preserve">Update: 2026-02-22 (Webhook map + state model + idempotency/events hardening)</w:t>
+      </w:r>
+    </w:p>
+    <w:p>
+      <w:pPr/>
+      <w:r>
+        <w:rPr>
+          <w:rFonts w:ascii="Helvetica Light" w:hAnsi="Helvetica Light" w:cs="Helvetica Light"/>
+          <w:sz w:val="24"/>
+          <w:sz-cs w:val="24"/>
+        </w:rPr>
+        <w:t xml:space="preserve">- Added immutable messaging event model/table (`MessageEvents`) with analytics-grade normalized fields:</w:t>
+      </w:r>
+    </w:p>
+    <w:p>
+      <w:pPr/>
+      <w:r>
+        <w:rPr>
+          <w:rFonts w:ascii="Helvetica Light" w:hAnsi="Helvetica Light" w:cs="Helvetica Light"/>
+          <w:sz w:val="24"/>
+          <w:sz-cs w:val="24"/>
+        </w:rPr>
+        <w:t xml:space="preserve">  - recipient_id, conversation.id, conversation.origin.type, conversation.expiration_timestamp</w:t>
+      </w:r>
+    </w:p>
+    <w:p>
+      <w:pPr/>
+      <w:r>
+        <w:rPr>
+          <w:rFonts w:ascii="Helvetica Light" w:hAnsi="Helvetica Light" w:cs="Helvetica Light"/>
+          <w:sz w:val="24"/>
+          <w:sz-cs w:val="24"/>
+        </w:rPr>
+        <w:t xml:space="preserve">  - pricing.billable, pricing.category</w:t>
+      </w:r>
+    </w:p>
+    <w:p>
+      <w:pPr/>
+      <w:r>
+        <w:rPr>
+          <w:rFonts w:ascii="Helvetica Light" w:hAnsi="Helvetica Light" w:cs="Helvetica Light"/>
+          <w:sz w:val="24"/>
+          <w:sz-cs w:val="24"/>
+        </w:rPr>
+        <w:t xml:space="preserve">  - media/button/interactive/list structured fields</w:t>
+      </w:r>
+    </w:p>
+    <w:p>
+      <w:pPr/>
+      <w:r>
+        <w:rPr>
+          <w:rFonts w:ascii="Helvetica Light" w:hAnsi="Helvetica Light" w:cs="Helvetica Light"/>
+          <w:sz w:val="24"/>
+          <w:sz-cs w:val="24"/>
+        </w:rPr>
+        <w:t xml:space="preserve">- Added dedicated idempotency model/table (`IdempotencyKeys`) and unique tenant+key index.</w:t>
+      </w:r>
+    </w:p>
+    <w:p>
+      <w:pPr/>
+      <w:r>
+        <w:rPr>
+          <w:rFonts w:ascii="Helvetica Light" w:hAnsi="Helvetica Light" w:cs="Helvetica Light"/>
+          <w:sz w:val="24"/>
+          <w:sz-cs w:val="24"/>
+        </w:rPr>
+        <w:t xml:space="preserve">- Extended tenant schema bootstrap in seed flow to auto-create `IdempotencyKeys` and `MessageEvents` for older DBs.</w:t>
+      </w:r>
+    </w:p>
+    <w:p>
+      <w:pPr/>
+      <w:r>
+        <w:rPr>
+          <w:rFonts w:ascii="Helvetica Light" w:hAnsi="Helvetica Light" w:cs="Helvetica Light"/>
+          <w:sz w:val="24"/>
+          <w:sz-cs w:val="24"/>
+        </w:rPr>
+        <w:t xml:space="preserve">- Extended webhook parser to capture additional WhatsApp payload fields and persist raw+normalized event rows.</w:t>
+      </w:r>
+    </w:p>
+    <w:p>
+      <w:pPr/>
+      <w:r>
+        <w:rPr>
+          <w:rFonts w:ascii="Helvetica Light" w:hAnsi="Helvetica Light" w:cs="Helvetica Light"/>
+          <w:sz w:val="24"/>
+          <w:sz-cs w:val="24"/>
+        </w:rPr>
+        <w:t xml:space="preserve">- Added explicit message state machine transition matrix and strict terminal-state behavior.</w:t>
+      </w:r>
+    </w:p>
+    <w:p>
+      <w:pPr/>
+      <w:r>
+        <w:rPr>
+          <w:rFonts w:ascii="Helvetica Light" w:hAnsi="Helvetica Light" w:cs="Helvetica Light"/>
+          <w:sz w:val="24"/>
+          <w:sz-cs w:val="24"/>
+        </w:rPr>
+        <w:t xml:space="preserve">- Added WABA error policy catalog seed for deterministic retryable/permanent classification:</w:t>
+      </w:r>
+    </w:p>
+    <w:p>
+      <w:pPr/>
+      <w:r>
+        <w:rPr>
+          <w:rFonts w:ascii="Helvetica Light" w:hAnsi="Helvetica Light" w:cs="Helvetica Light"/>
+          <w:sz w:val="24"/>
+          <w:sz-cs w:val="24"/>
+        </w:rPr>
+        <w:t xml:space="preserve">  - Includes core codes (2,4,80007,131016 retryable; 190,200,10,131026,132000,132001 permanent).</w:t>
+      </w:r>
+    </w:p>
+    <w:p>
+      <w:pPr/>
+      <w:r>
+        <w:rPr>
+          <w:rFonts w:ascii="Helvetica Light" w:hAnsi="Helvetica Light" w:cs="Helvetica Light"/>
+          <w:sz w:val="24"/>
+          <w:sz-cs w:val="24"/>
+        </w:rPr>
+        <w:t xml:space="preserve">- Outbound queue-first/idempotency work remains active with in-memory+Redis provider support and memory fallback for rabbitmq/sqs providers.</w:t>
       </w:r>
     </w:p>
     <w:sectPr/>

</xml_diff>

<commit_message>
Enforce plan limits for contacts/automation and wire billing-aware UI gates
</commit_message>
<xml_diff>
--- a/masterrequirement.docx
+++ b/masterrequirement.docx
@@ -1672,6 +1672,171 @@
           <w:sz-cs w:val="24"/>
         </w:rPr>
         <w:t xml:space="preserve">- Outbound queue-first/idempotency work remains active with in-memory+Redis provider support and memory fallback for rabbitmq/sqs providers.</w:t>
+      </w:r>
+    </w:p>
+    <w:p>
+      <w:pPr/>
+      <w:r>
+        <w:rPr>
+          <w:rFonts w:ascii="Helvetica Light" w:hAnsi="Helvetica Light" w:cs="Helvetica Light"/>
+          <w:sz w:val="24"/>
+          <w:sz-cs w:val="24"/>
+        </w:rPr>
+        <w:t xml:space="preserve"/>
+      </w:r>
+    </w:p>
+    <w:p>
+      <w:pPr/>
+      <w:r>
+        <w:rPr>
+          <w:rFonts w:ascii="Helvetica Light" w:hAnsi="Helvetica Light" w:cs="Helvetica Light"/>
+          <w:sz w:val="24"/>
+          <w:sz-cs w:val="24"/>
+        </w:rPr>
+        <w:t xml:space="preserve">Update: 2026-02-22 (Plan-limit enforcement + frontend wiring)</w:t>
+      </w:r>
+    </w:p>
+    <w:p>
+      <w:pPr/>
+      <w:r>
+        <w:rPr>
+          <w:rFonts w:ascii="Helvetica Light" w:hAnsi="Helvetica Light" w:cs="Helvetica Light"/>
+          <w:sz w:val="24"/>
+          <w:sz-cs w:val="24"/>
+        </w:rPr>
+        <w:t xml:space="preserve">- Backend hard limit enforcement expanded:</w:t>
+      </w:r>
+    </w:p>
+    <w:p>
+      <w:pPr/>
+      <w:r>
+        <w:rPr>
+          <w:rFonts w:ascii="Helvetica Light" w:hAnsi="Helvetica Light" w:cs="Helvetica Light"/>
+          <w:sz w:val="24"/>
+          <w:sz-cs w:val="24"/>
+        </w:rPr>
+        <w:t xml:space="preserve">  - Contacts create checks `contacts` plan limit before insert.</w:t>
+      </w:r>
+    </w:p>
+    <w:p>
+      <w:pPr/>
+      <w:r>
+        <w:rPr>
+          <w:rFonts w:ascii="Helvetica Light" w:hAnsi="Helvetica Light" w:cs="Helvetica Light"/>
+          <w:sz w:val="24"/>
+          <w:sz-cs w:val="24"/>
+        </w:rPr>
+        <w:t xml:space="preserve">  - CSV import checks projected contact usage before bulk insert.</w:t>
+      </w:r>
+    </w:p>
+    <w:p>
+      <w:pPr/>
+      <w:r>
+        <w:rPr>
+          <w:rFonts w:ascii="Helvetica Light" w:hAnsi="Helvetica Light" w:cs="Helvetica Light"/>
+          <w:sz w:val="24"/>
+          <w:sz-cs w:val="24"/>
+        </w:rPr>
+        <w:t xml:space="preserve">  - Automation flow create checks `flows` limit.</w:t>
+      </w:r>
+    </w:p>
+    <w:p>
+      <w:pPr/>
+      <w:r>
+        <w:rPr>
+          <w:rFonts w:ascii="Helvetica Light" w:hAnsi="Helvetica Light" w:cs="Helvetica Light"/>
+          <w:sz w:val="24"/>
+          <w:sz-cs w:val="24"/>
+        </w:rPr>
+        <w:t xml:space="preserve">  - Automation publish checks `chatbots` (active bots) limit.</w:t>
+      </w:r>
+    </w:p>
+    <w:p>
+      <w:pPr/>
+      <w:r>
+        <w:rPr>
+          <w:rFonts w:ascii="Helvetica Light" w:hAnsi="Helvetica Light" w:cs="Helvetica Light"/>
+          <w:sz w:val="24"/>
+          <w:sz-cs w:val="24"/>
+        </w:rPr>
+        <w:t xml:space="preserve">- Backend usage sync expanded:</w:t>
+      </w:r>
+    </w:p>
+    <w:p>
+      <w:pPr/>
+      <w:r>
+        <w:rPr>
+          <w:rFonts w:ascii="Helvetica Light" w:hAnsi="Helvetica Light" w:cs="Helvetica Light"/>
+          <w:sz w:val="24"/>
+          <w:sz-cs w:val="24"/>
+        </w:rPr>
+        <w:t xml:space="preserve">  - Contacts usage absolute counter updated after create/delete/import.</w:t>
+      </w:r>
+    </w:p>
+    <w:p>
+      <w:pPr/>
+      <w:r>
+        <w:rPr>
+          <w:rFonts w:ascii="Helvetica Light" w:hAnsi="Helvetica Light" w:cs="Helvetica Light"/>
+          <w:sz w:val="24"/>
+          <w:sz-cs w:val="24"/>
+        </w:rPr>
+        <w:t xml:space="preserve">  - Team member usage absolute counter updated after invite/remove.</w:t>
+      </w:r>
+    </w:p>
+    <w:p>
+      <w:pPr/>
+      <w:r>
+        <w:rPr>
+          <w:rFonts w:ascii="Helvetica Light" w:hAnsi="Helvetica Light" w:cs="Helvetica Light"/>
+          <w:sz w:val="24"/>
+          <w:sz-cs w:val="24"/>
+        </w:rPr>
+        <w:t xml:space="preserve">  - Automation usage absolute counters synced for `flows` and `chatbots` on create/publish/unpublish/delete/rollback.</w:t>
+      </w:r>
+    </w:p>
+    <w:p>
+      <w:pPr/>
+      <w:r>
+        <w:rPr>
+          <w:rFonts w:ascii="Helvetica Light" w:hAnsi="Helvetica Light" w:cs="Helvetica Light"/>
+          <w:sz w:val="24"/>
+          <w:sz-cs w:val="24"/>
+        </w:rPr>
+        <w:t xml:space="preserve">- Frontend billing-aware UX wiring:</w:t>
+      </w:r>
+    </w:p>
+    <w:p>
+      <w:pPr/>
+      <w:r>
+        <w:rPr>
+          <w:rFonts w:ascii="Helvetica Light" w:hAnsi="Helvetica Light" w:cs="Helvetica Light"/>
+          <w:sz w:val="24"/>
+          <w:sz-cs w:val="24"/>
+        </w:rPr>
+        <w:t xml:space="preserve">  - Contacts page loads billing usage+limits and disables Add Contact when plan limit is reached.</w:t>
+      </w:r>
+    </w:p>
+    <w:p>
+      <w:pPr/>
+      <w:r>
+        <w:rPr>
+          <w:rFonts w:ascii="Helvetica Light" w:hAnsi="Helvetica Light" w:cs="Helvetica Light"/>
+          <w:sz w:val="24"/>
+          <w:sz-cs w:val="24"/>
+        </w:rPr>
+        <w:t xml:space="preserve">  - Automations page loads billing usage+limits and disables Create Bot / Publish when flow or active-bot limits are reached.</w:t>
+      </w:r>
+    </w:p>
+    <w:p>
+      <w:pPr/>
+      <w:r>
+        <w:rPr>
+          <w:rFonts w:ascii="Helvetica Light" w:hAnsi="Helvetica Light" w:cs="Helvetica Light"/>
+          <w:sz w:val="24"/>
+          <w:sz-cs w:val="24"/>
+        </w:rPr>
+        <w:t xml:space="preserve">  - Added inline plan usage hints on contacts and automation KPI cards.</w:t>
       </w:r>
     </w:p>
     <w:sectPr/>

</xml_diff>

<commit_message>
Add platform queue health, WABA error policy, and webhook analytics wiring
</commit_message>
<xml_diff>
--- a/masterrequirement.docx
+++ b/masterrequirement.docx
@@ -1837,6 +1837,149 @@
           <w:sz-cs w:val="24"/>
         </w:rPr>
         <w:t xml:space="preserve">  - Added inline plan usage hints on contacts and automation KPI cards.</w:t>
+      </w:r>
+    </w:p>
+    <w:p>
+      <w:pPr/>
+      <w:r>
+        <w:rPr>
+          <w:rFonts w:ascii="Helvetica Light" w:hAnsi="Helvetica Light" w:cs="Helvetica Light"/>
+          <w:sz w:val="24"/>
+          <w:sz-cs w:val="24"/>
+        </w:rPr>
+        <w:t xml:space="preserve"/>
+      </w:r>
+    </w:p>
+    <w:p>
+      <w:pPr/>
+      <w:r>
+        <w:rPr>
+          <w:rFonts w:ascii="Helvetica Light" w:hAnsi="Helvetica Light" w:cs="Helvetica Light"/>
+          <w:sz w:val="24"/>
+          <w:sz-cs w:val="24"/>
+        </w:rPr>
+        <w:t xml:space="preserve">Update: 2026-02-22 (Platform ops wiring: queue health + WABA policy + analytics)</w:t>
+      </w:r>
+    </w:p>
+    <w:p>
+      <w:pPr/>
+      <w:r>
+        <w:rPr>
+          <w:rFonts w:ascii="Helvetica Light" w:hAnsi="Helvetica Light" w:cs="Helvetica Light"/>
+          <w:sz w:val="24"/>
+          <w:sz-cs w:val="24"/>
+        </w:rPr>
+        <w:t xml:space="preserve">- Added platform backend APIs:</w:t>
+      </w:r>
+    </w:p>
+    <w:p>
+      <w:pPr/>
+      <w:r>
+        <w:rPr>
+          <w:rFonts w:ascii="Helvetica Light" w:hAnsi="Helvetica Light" w:cs="Helvetica Light"/>
+          <w:sz w:val="24"/>
+          <w:sz-cs w:val="24"/>
+        </w:rPr>
+        <w:t xml:space="preserve">  - `GET /api/platform/queue-health` (outbound/webhook queue depth + retry/dead-letter counters)</w:t>
+      </w:r>
+    </w:p>
+    <w:p>
+      <w:pPr/>
+      <w:r>
+        <w:rPr>
+          <w:rFonts w:ascii="Helvetica Light" w:hAnsi="Helvetica Light" w:cs="Helvetica Light"/>
+          <w:sz w:val="24"/>
+          <w:sz-cs w:val="24"/>
+        </w:rPr>
+        <w:t xml:space="preserve">  - `GET/POST/DELETE /api/platform/waba-error-policies` (retryable/permanent policy management)</w:t>
+      </w:r>
+    </w:p>
+    <w:p>
+      <w:pPr/>
+      <w:r>
+        <w:rPr>
+          <w:rFonts w:ascii="Helvetica Light" w:hAnsi="Helvetica Light" w:cs="Helvetica Light"/>
+          <w:sz w:val="24"/>
+          <w:sz-cs w:val="24"/>
+        </w:rPr>
+        <w:t xml:space="preserve">  - `GET /api/platform/webhook-analytics` (status/pricing/origin/failure/trend analytics; tenant-aware)</w:t>
+      </w:r>
+    </w:p>
+    <w:p>
+      <w:pPr/>
+      <w:r>
+        <w:rPr>
+          <w:rFonts w:ascii="Helvetica Light" w:hAnsi="Helvetica Light" w:cs="Helvetica Light"/>
+          <w:sz w:val="24"/>
+          <w:sz-cs w:val="24"/>
+        </w:rPr>
+        <w:t xml:space="preserve">- Queue services upgraded with depth introspection:</w:t>
+      </w:r>
+    </w:p>
+    <w:p>
+      <w:pPr/>
+      <w:r>
+        <w:rPr>
+          <w:rFonts w:ascii="Helvetica Light" w:hAnsi="Helvetica Light" w:cs="Helvetica Light"/>
+          <w:sz w:val="24"/>
+          <w:sz-cs w:val="24"/>
+        </w:rPr>
+        <w:t xml:space="preserve">  - webhook queue depth for memory + redis providers</w:t>
+      </w:r>
+    </w:p>
+    <w:p>
+      <w:pPr/>
+      <w:r>
+        <w:rPr>
+          <w:rFonts w:ascii="Helvetica Light" w:hAnsi="Helvetica Light" w:cs="Helvetica Light"/>
+          <w:sz w:val="24"/>
+          <w:sz-cs w:val="24"/>
+        </w:rPr>
+        <w:t xml:space="preserve">  - outbound queue depth for memory + redis providers</w:t>
+      </w:r>
+    </w:p>
+    <w:p>
+      <w:pPr/>
+      <w:r>
+        <w:rPr>
+          <w:rFonts w:ascii="Helvetica Light" w:hAnsi="Helvetica Light" w:cs="Helvetica Light"/>
+          <w:sz w:val="24"/>
+          <w:sz-cs w:val="24"/>
+        </w:rPr>
+        <w:t xml:space="preserve">- Frontend Platform Settings wiring completed:</w:t>
+      </w:r>
+    </w:p>
+    <w:p>
+      <w:pPr/>
+      <w:r>
+        <w:rPr>
+          <w:rFonts w:ascii="Helvetica Light" w:hAnsi="Helvetica Light" w:cs="Helvetica Light"/>
+          <w:sz w:val="24"/>
+          <w:sz-cs w:val="24"/>
+        </w:rPr>
+        <w:t xml:space="preserve">  - New tab: WABA Error Policies (list/upsert/deactivate)</w:t>
+      </w:r>
+    </w:p>
+    <w:p>
+      <w:pPr/>
+      <w:r>
+        <w:rPr>
+          <w:rFonts w:ascii="Helvetica Light" w:hAnsi="Helvetica Light" w:cs="Helvetica Light"/>
+          <w:sz w:val="24"/>
+          <w:sz-cs w:val="24"/>
+        </w:rPr>
+        <w:t xml:space="preserve">  - Webhook Logs tab now includes queue health KPI cards</w:t>
+      </w:r>
+    </w:p>
+    <w:p>
+      <w:pPr/>
+      <w:r>
+        <w:rPr>
+          <w:rFonts w:ascii="Helvetica Light" w:hAnsi="Helvetica Light" w:cs="Helvetica Light"/>
+          <w:sz w:val="24"/>
+          <w:sz-cs w:val="24"/>
+        </w:rPr>
+        <w:t xml:space="preserve">  - Webhook analytics panel (tenant selector, days filter, status/failure summaries)</w:t>
       </w:r>
     </w:p>
     <w:sectPr/>

</xml_diff>

<commit_message>
Add tenant webhook analytics, idempotency diagnostics, queue transports, and update automations UI
</commit_message>
<xml_diff>
--- a/masterrequirement.docx
+++ b/masterrequirement.docx
@@ -1980,6 +1980,215 @@
           <w:sz-cs w:val="24"/>
         </w:rPr>
         <w:t xml:space="preserve">  - Webhook analytics panel (tenant selector, days filter, status/failure summaries)</w:t>
+      </w:r>
+    </w:p>
+    <w:p>
+      <w:pPr/>
+      <w:r>
+        <w:rPr>
+          <w:rFonts w:ascii="Helvetica Light" w:hAnsi="Helvetica Light" w:cs="Helvetica Light"/>
+          <w:sz w:val="24"/>
+          <w:sz-cs w:val="24"/>
+        </w:rPr>
+        <w:t xml:space="preserve"/>
+      </w:r>
+    </w:p>
+    <w:p>
+      <w:pPr/>
+      <w:r>
+        <w:rPr>
+          <w:rFonts w:ascii="Helvetica Light" w:hAnsi="Helvetica Light" w:cs="Helvetica Light"/>
+          <w:sz w:val="24"/>
+          <w:sz-cs w:val="24"/>
+        </w:rPr>
+        <w:t xml:space="preserve">Update: 2026-02-22 (Tenant analytics + idempotency diagnostics + real Rabbit/SQS transport)</w:t>
+      </w:r>
+    </w:p>
+    <w:p>
+      <w:pPr/>
+      <w:r>
+        <w:rPr>
+          <w:rFonts w:ascii="Helvetica Light" w:hAnsi="Helvetica Light" w:cs="Helvetica Light"/>
+          <w:sz w:val="24"/>
+          <w:sz-cs w:val="24"/>
+        </w:rPr>
+        <w:t xml:space="preserve">- Added tenant-scoped webhook analytics API:</w:t>
+      </w:r>
+    </w:p>
+    <w:p>
+      <w:pPr/>
+      <w:r>
+        <w:rPr>
+          <w:rFonts w:ascii="Helvetica Light" w:hAnsi="Helvetica Light" w:cs="Helvetica Light"/>
+          <w:sz w:val="24"/>
+          <w:sz-cs w:val="24"/>
+        </w:rPr>
+        <w:t xml:space="preserve">  - `GET /api/analytics/webhook?days=7`</w:t>
+      </w:r>
+    </w:p>
+    <w:p>
+      <w:pPr/>
+      <w:r>
+        <w:rPr>
+          <w:rFonts w:ascii="Helvetica Light" w:hAnsi="Helvetica Light" w:cs="Helvetica Light"/>
+          <w:sz w:val="24"/>
+          <w:sz-cs w:val="24"/>
+        </w:rPr>
+        <w:t xml:space="preserve">  - Returns tenant status summary, pricing summary, origin summary, failure code summary, and daily trend.</w:t>
+      </w:r>
+    </w:p>
+    <w:p>
+      <w:pPr/>
+      <w:r>
+        <w:rPr>
+          <w:rFonts w:ascii="Helvetica Light" w:hAnsi="Helvetica Light" w:cs="Helvetica Light"/>
+          <w:sz w:val="24"/>
+          <w:sz-cs w:val="24"/>
+        </w:rPr>
+        <w:t xml:space="preserve">- Added idempotency diagnostics APIs:</w:t>
+      </w:r>
+    </w:p>
+    <w:p>
+      <w:pPr/>
+      <w:r>
+        <w:rPr>
+          <w:rFonts w:ascii="Helvetica Light" w:hAnsi="Helvetica Light" w:cs="Helvetica Light"/>
+          <w:sz w:val="24"/>
+          <w:sz-cs w:val="24"/>
+        </w:rPr>
+        <w:t xml:space="preserve">  - Tenant: `GET /api/idempotency/diagnostics?status=&amp;staleMinutes=30&amp;limit=200`</w:t>
+      </w:r>
+    </w:p>
+    <w:p>
+      <w:pPr/>
+      <w:r>
+        <w:rPr>
+          <w:rFonts w:ascii="Helvetica Light" w:hAnsi="Helvetica Light" w:cs="Helvetica Light"/>
+          <w:sz w:val="24"/>
+          <w:sz-cs w:val="24"/>
+        </w:rPr>
+        <w:t xml:space="preserve">  - Platform: `GET /api/platform/idempotency-diagnostics?tenantId=...&amp;status=&amp;staleMinutes=30&amp;limit=300`</w:t>
+      </w:r>
+    </w:p>
+    <w:p>
+      <w:pPr/>
+      <w:r>
+        <w:rPr>
+          <w:rFonts w:ascii="Helvetica Light" w:hAnsi="Helvetica Light" w:cs="Helvetica Light"/>
+          <w:sz w:val="24"/>
+          <w:sz-cs w:val="24"/>
+        </w:rPr>
+        <w:t xml:space="preserve">  - Includes status summary + stale reserved key detection.</w:t>
+      </w:r>
+    </w:p>
+    <w:p>
+      <w:pPr/>
+      <w:r>
+        <w:rPr>
+          <w:rFonts w:ascii="Helvetica Light" w:hAnsi="Helvetica Light" w:cs="Helvetica Light"/>
+          <w:sz w:val="24"/>
+          <w:sz-cs w:val="24"/>
+        </w:rPr>
+        <w:t xml:space="preserve">- Added tenant dashboard webhook analytics UI:</w:t>
+      </w:r>
+    </w:p>
+    <w:p>
+      <w:pPr/>
+      <w:r>
+        <w:rPr>
+          <w:rFonts w:ascii="Helvetica Light" w:hAnsi="Helvetica Light" w:cs="Helvetica Light"/>
+          <w:sz w:val="24"/>
+          <w:sz-cs w:val="24"/>
+        </w:rPr>
+        <w:t xml:space="preserve">  - Dashboard now shows webhook status bar chart + failure-code diagnostics card with day filter.</w:t>
+      </w:r>
+    </w:p>
+    <w:p>
+      <w:pPr/>
+      <w:r>
+        <w:rPr>
+          <w:rFonts w:ascii="Helvetica Light" w:hAnsi="Helvetica Light" w:cs="Helvetica Light"/>
+          <w:sz w:val="24"/>
+          <w:sz-cs w:val="24"/>
+        </w:rPr>
+        <w:t xml:space="preserve">- Added platform idempotency diagnostics UI:</w:t>
+      </w:r>
+    </w:p>
+    <w:p>
+      <w:pPr/>
+      <w:r>
+        <w:rPr>
+          <w:rFonts w:ascii="Helvetica Light" w:hAnsi="Helvetica Light" w:cs="Helvetica Light"/>
+          <w:sz w:val="24"/>
+          <w:sz-cs w:val="24"/>
+        </w:rPr>
+        <w:t xml:space="preserve">  - New Platform Settings tab with tenant/status/stale filters and diagnostics table.</w:t>
+      </w:r>
+    </w:p>
+    <w:p>
+      <w:pPr/>
+      <w:r>
+        <w:rPr>
+          <w:rFonts w:ascii="Helvetica Light" w:hAnsi="Helvetica Light" w:cs="Helvetica Light"/>
+          <w:sz w:val="24"/>
+          <w:sz-cs w:val="24"/>
+        </w:rPr>
+        <w:t xml:space="preserve">- Upgraded queue transport support in both queue services:</w:t>
+      </w:r>
+    </w:p>
+    <w:p>
+      <w:pPr/>
+      <w:r>
+        <w:rPr>
+          <w:rFonts w:ascii="Helvetica Light" w:hAnsi="Helvetica Light" w:cs="Helvetica Light"/>
+          <w:sz w:val="24"/>
+          <w:sz-cs w:val="24"/>
+        </w:rPr>
+        <w:t xml:space="preserve">  - Implemented real providers for `rabbitmq` and `sqs` (enqueue/dequeue/depth), alongside existing `memory` and `redis`.</w:t>
+      </w:r>
+    </w:p>
+    <w:p>
+      <w:pPr/>
+      <w:r>
+        <w:rPr>
+          <w:rFonts w:ascii="Helvetica Light" w:hAnsi="Helvetica Light" w:cs="Helvetica Light"/>
+          <w:sz w:val="24"/>
+          <w:sz-cs w:val="24"/>
+        </w:rPr>
+        <w:t xml:space="preserve">  - Removed previous rabbitmq/sqs "always fallback" behavior.</w:t>
+      </w:r>
+    </w:p>
+    <w:p>
+      <w:pPr/>
+      <w:r>
+        <w:rPr>
+          <w:rFonts w:ascii="Helvetica Light" w:hAnsi="Helvetica Light" w:cs="Helvetica Light"/>
+          <w:sz w:val="24"/>
+          <w:sz-cs w:val="24"/>
+        </w:rPr>
+        <w:t xml:space="preserve">- Added backend package references:</w:t>
+      </w:r>
+    </w:p>
+    <w:p>
+      <w:pPr/>
+      <w:r>
+        <w:rPr>
+          <w:rFonts w:ascii="Helvetica Light" w:hAnsi="Helvetica Light" w:cs="Helvetica Light"/>
+          <w:sz w:val="24"/>
+          <w:sz-cs w:val="24"/>
+        </w:rPr>
+        <w:t xml:space="preserve">  - `RabbitMQ.Client`</w:t>
+      </w:r>
+    </w:p>
+    <w:p>
+      <w:pPr/>
+      <w:r>
+        <w:rPr>
+          <w:rFonts w:ascii="Helvetica Light" w:hAnsi="Helvetica Light" w:cs="Helvetica Light"/>
+          <w:sz w:val="24"/>
+          <w:sz-cs w:val="24"/>
+        </w:rPr>
+        <w:t xml:space="preserve">  - `AWSSDK.SQS`</w:t>
       </w:r>
     </w:p>
     <w:sectPr/>

</xml_diff>

<commit_message>
fix(inbox): stabilize realtime hub lifecycle and voice media send flow
</commit_message>
<xml_diff>
--- a/masterrequirement.docx
+++ b/masterrequirement.docx
@@ -2189,6 +2189,149 @@
           <w:sz-cs w:val="24"/>
         </w:rPr>
         <w:t xml:space="preserve">  - `AWSSDK.SQS`</w:t>
+      </w:r>
+    </w:p>
+    <w:p>
+      <w:pPr/>
+      <w:r>
+        <w:rPr>
+          <w:rFonts w:ascii="Helvetica Light" w:hAnsi="Helvetica Light" w:cs="Helvetica Light"/>
+          <w:sz w:val="24"/>
+          <w:sz-cs w:val="24"/>
+        </w:rPr>
+        <w:t xml:space="preserve"/>
+      </w:r>
+    </w:p>
+    <w:p>
+      <w:pPr/>
+      <w:r>
+        <w:rPr>
+          <w:rFonts w:ascii="Helvetica Light" w:hAnsi="Helvetica Light" w:cs="Helvetica Light"/>
+          <w:sz w:val="24"/>
+          <w:sz-cs w:val="24"/>
+        </w:rPr>
+        <w:t xml:space="preserve">Update: 2026-02-25 (Inbox realtime stability + voice send clarity)</w:t>
+      </w:r>
+    </w:p>
+    <w:p>
+      <w:pPr/>
+      <w:r>
+        <w:rPr>
+          <w:rFonts w:ascii="Helvetica Light" w:hAnsi="Helvetica Light" w:cs="Helvetica Light"/>
+          <w:sz w:val="24"/>
+          <w:sz-cs w:val="24"/>
+        </w:rPr>
+        <w:t xml:space="preserve">- Inbox SignalR lifecycle stabilized to reduce start/stop race and reconnect churn:</w:t>
+      </w:r>
+    </w:p>
+    <w:p>
+      <w:pPr/>
+      <w:r>
+        <w:rPr>
+          <w:rFonts w:ascii="Helvetica Light" w:hAnsi="Helvetica Light" w:cs="Helvetica Light"/>
+          <w:sz w:val="24"/>
+          <w:sz-cs w:val="24"/>
+        </w:rPr>
+        <w:t xml:space="preserve">  - removed volatile dependencies from hub effect</w:t>
+      </w:r>
+    </w:p>
+    <w:p>
+      <w:pPr/>
+      <w:r>
+        <w:rPr>
+          <w:rFonts w:ascii="Helvetica Light" w:hAnsi="Helvetica Light" w:cs="Helvetica Light"/>
+          <w:sz w:val="24"/>
+          <w:sz-cs w:val="24"/>
+        </w:rPr>
+        <w:t xml:space="preserve">  - switched to refs for current user email and notification sound callback</w:t>
+      </w:r>
+    </w:p>
+    <w:p>
+      <w:pPr/>
+      <w:r>
+        <w:rPr>
+          <w:rFonts w:ascii="Helvetica Light" w:hAnsi="Helvetica Light" w:cs="Helvetica Light"/>
+          <w:sz w:val="24"/>
+          <w:sz-cs w:val="24"/>
+        </w:rPr>
+        <w:t xml:space="preserve">  - cleanup now leaves room + stops connection safely after startup promise</w:t>
+      </w:r>
+    </w:p>
+    <w:p>
+      <w:pPr/>
+      <w:r>
+        <w:rPr>
+          <w:rFonts w:ascii="Helvetica Light" w:hAnsi="Helvetica Light" w:cs="Helvetica Light"/>
+          <w:sz w:val="24"/>
+          <w:sz-cs w:val="24"/>
+        </w:rPr>
+        <w:t xml:space="preserve">- Voice/media send UX hardened:</w:t>
+      </w:r>
+    </w:p>
+    <w:p>
+      <w:pPr/>
+      <w:r>
+        <w:rPr>
+          <w:rFonts w:ascii="Helvetica Light" w:hAnsi="Helvetica Light" w:cs="Helvetica Light"/>
+          <w:sz w:val="24"/>
+          <w:sz-cs w:val="24"/>
+        </w:rPr>
+        <w:t xml:space="preserve">  - enforced 24h session gate before media send in inbox composer</w:t>
+      </w:r>
+    </w:p>
+    <w:p>
+      <w:pPr/>
+      <w:r>
+        <w:rPr>
+          <w:rFonts w:ascii="Helvetica Light" w:hAnsi="Helvetica Light" w:cs="Helvetica Light"/>
+          <w:sz w:val="24"/>
+          <w:sz-cs w:val="24"/>
+        </w:rPr>
+        <w:t xml:space="preserve">  - voice/media now show queued vs sent status from backend response instead of always showing sent</w:t>
+      </w:r>
+    </w:p>
+    <w:p>
+      <w:pPr/>
+      <w:r>
+        <w:rPr>
+          <w:rFonts w:ascii="Helvetica Light" w:hAnsi="Helvetica Light" w:cs="Helvetica Light"/>
+          <w:sz w:val="24"/>
+          <w:sz-cs w:val="24"/>
+        </w:rPr>
+        <w:t xml:space="preserve">  - recorder MIME preference updated toward WhatsApp-compatible audio (`audio/ogg;codecs=opus`, `audio/ogg`, `audio/mp4`, `audio/mpeg`, `audio/aac`)</w:t>
+      </w:r>
+    </w:p>
+    <w:p>
+      <w:pPr/>
+      <w:r>
+        <w:rPr>
+          <w:rFonts w:ascii="Helvetica Light" w:hAnsi="Helvetica Light" w:cs="Helvetica Light"/>
+          <w:sz w:val="24"/>
+          <w:sz-cs w:val="24"/>
+        </w:rPr>
+        <w:t xml:space="preserve">- Expected behavior after deploy:</w:t>
+      </w:r>
+    </w:p>
+    <w:p>
+      <w:pPr/>
+      <w:r>
+        <w:rPr>
+          <w:rFonts w:ascii="Helvetica Light" w:hAnsi="Helvetica Light" w:cs="Helvetica Light"/>
+          <w:sz w:val="24"/>
+          <w:sz-cs w:val="24"/>
+        </w:rPr>
+        <w:t xml:space="preserve">  - fewer transient "Failed to start HttpConnection before stop() was called" errors</w:t>
+      </w:r>
+    </w:p>
+    <w:p>
+      <w:pPr/>
+      <w:r>
+        <w:rPr>
+          <w:rFonts w:ascii="Helvetica Light" w:hAnsi="Helvetica Light" w:cs="Helvetica Light"/>
+          <w:sz w:val="24"/>
+          <w:sz-cs w:val="24"/>
+        </w:rPr>
+        <w:t xml:space="preserve">  - voice sends no longer look fake; user sees queued state until acceptance/status updates</w:t>
       </w:r>
     </w:p>
     <w:sectPr/>

</xml_diff>

<commit_message>
feat(templates): add live preview, media headers, and shared template library sync
</commit_message>
<xml_diff>
--- a/masterrequirement.docx
+++ b/masterrequirement.docx
@@ -2332,6 +2332,325 @@
           <w:sz-cs w:val="24"/>
         </w:rPr>
         <w:t xml:space="preserve">  - voice sends no longer look fake; user sees queued state until acceptance/status updates</w:t>
+      </w:r>
+    </w:p>
+    <w:p>
+      <w:pPr/>
+      <w:r>
+        <w:rPr>
+          <w:rFonts w:ascii="Helvetica Light" w:hAnsi="Helvetica Light" w:cs="Helvetica Light"/>
+          <w:sz w:val="24"/>
+          <w:sz-cs w:val="24"/>
+        </w:rPr>
+        <w:t xml:space="preserve"/>
+      </w:r>
+    </w:p>
+    <w:p>
+      <w:pPr/>
+      <w:r>
+        <w:rPr>
+          <w:rFonts w:ascii="Helvetica Light" w:hAnsi="Helvetica Light" w:cs="Helvetica Light"/>
+          <w:sz w:val="24"/>
+          <w:sz-cs w:val="24"/>
+        </w:rPr>
+        <w:t xml:space="preserve">Update: 2026-02-25 (Template lifecycle + system variable presets)</w:t>
+      </w:r>
+    </w:p>
+    <w:p>
+      <w:pPr/>
+      <w:r>
+        <w:rPr>
+          <w:rFonts w:ascii="Helvetica Light" w:hAnsi="Helvetica Light" w:cs="Helvetica Light"/>
+          <w:sz w:val="24"/>
+          <w:sz-cs w:val="24"/>
+        </w:rPr>
+        <w:t xml:space="preserve">- Removed automatic WhatsApp template sync during onboarding/reuse/map flows. Templates remain DB-only unless user clicks `Sync Meta`.</w:t>
+      </w:r>
+    </w:p>
+    <w:p>
+      <w:pPr/>
+      <w:r>
+        <w:rPr>
+          <w:rFonts w:ascii="Helvetica Light" w:hAnsi="Helvetica Light" w:cs="Helvetica Light"/>
+          <w:sz w:val="24"/>
+          <w:sz-cs w:val="24"/>
+        </w:rPr>
+        <w:t xml:space="preserve">- WhatsApp template delete now calls Meta first and then deletes local DB record.</w:t>
+      </w:r>
+    </w:p>
+    <w:p>
+      <w:pPr/>
+      <w:r>
+        <w:rPr>
+          <w:rFonts w:ascii="Helvetica Light" w:hAnsi="Helvetica Light" w:cs="Helvetica Light"/>
+          <w:sz w:val="24"/>
+          <w:sz-cs w:val="24"/>
+        </w:rPr>
+        <w:t xml:space="preserve">- Added server-side template system variable resolver for send pipeline:</w:t>
+      </w:r>
+    </w:p>
+    <w:p>
+      <w:pPr/>
+      <w:r>
+        <w:rPr>
+          <w:rFonts w:ascii="Helvetica Light" w:hAnsi="Helvetica Light" w:cs="Helvetica Light"/>
+          <w:sz w:val="24"/>
+          <w:sz-cs w:val="24"/>
+        </w:rPr>
+        <w:t xml:space="preserve">  - supports tokens like `{{customer_name}}`, `{{company_name}}`, `{{agent_name}}`, `{{customer_phone}}`, `{{current_date}}`.</w:t>
+      </w:r>
+    </w:p>
+    <w:p>
+      <w:pPr/>
+      <w:r>
+        <w:rPr>
+          <w:rFonts w:ascii="Helvetica Light" w:hAnsi="Helvetica Light" w:cs="Helvetica Light"/>
+          <w:sz w:val="24"/>
+          <w:sz-cs w:val="24"/>
+        </w:rPr>
+        <w:t xml:space="preserve">  - resolves at API layer before enqueue/send.</w:t>
+      </w:r>
+    </w:p>
+    <w:p>
+      <w:pPr/>
+      <w:r>
+        <w:rPr>
+          <w:rFonts w:ascii="Helvetica Light" w:hAnsi="Helvetica Light" w:cs="Helvetica Light"/>
+          <w:sz w:val="24"/>
+          <w:sz-cs w:val="24"/>
+        </w:rPr>
+        <w:t xml:space="preserve">- Added template preset API: `GET /api/templates/{id}/presets?recipient=...` for token values + suggested variable mapping.</w:t>
+      </w:r>
+    </w:p>
+    <w:p>
+      <w:pPr/>
+      <w:r>
+        <w:rPr>
+          <w:rFonts w:ascii="Helvetica Light" w:hAnsi="Helvetica Light" w:cs="Helvetica Light"/>
+          <w:sz w:val="24"/>
+          <w:sz-cs w:val="24"/>
+        </w:rPr>
+        <w:t xml:space="preserve">- Locked WhatsApp lifecycle to Meta source of truth:</w:t>
+      </w:r>
+    </w:p>
+    <w:p>
+      <w:pPr/>
+      <w:r>
+        <w:rPr>
+          <w:rFonts w:ascii="Helvetica Light" w:hAnsi="Helvetica Light" w:cs="Helvetica Light"/>
+          <w:sz w:val="24"/>
+          <w:sz-cs w:val="24"/>
+        </w:rPr>
+        <w:t xml:space="preserve">  - local `approve/reject` endpoints now blocked for WhatsApp templates (use Sync).</w:t>
+      </w:r>
+    </w:p>
+    <w:p>
+      <w:pPr/>
+      <w:r>
+        <w:rPr>
+          <w:rFonts w:ascii="Helvetica Light" w:hAnsi="Helvetica Light" w:cs="Helvetica Light"/>
+          <w:sz w:val="24"/>
+          <w:sz-cs w:val="24"/>
+        </w:rPr>
+        <w:t xml:space="preserve">- Frontend templates UI:</w:t>
+      </w:r>
+    </w:p>
+    <w:p>
+      <w:pPr/>
+      <w:r>
+        <w:rPr>
+          <w:rFonts w:ascii="Helvetica Light" w:hAnsi="Helvetica Light" w:cs="Helvetica Light"/>
+          <w:sz w:val="24"/>
+          <w:sz-cs w:val="24"/>
+        </w:rPr>
+        <w:t xml:space="preserve">  - added warning confirmation dialog before delete.</w:t>
+      </w:r>
+    </w:p>
+    <w:p>
+      <w:pPr/>
+      <w:r>
+        <w:rPr>
+          <w:rFonts w:ascii="Helvetica Light" w:hAnsi="Helvetica Light" w:cs="Helvetica Light"/>
+          <w:sz w:val="24"/>
+          <w:sz-cs w:val="24"/>
+        </w:rPr>
+        <w:t xml:space="preserve">  - warning explicitly states WhatsApp delete removes from Meta + DB.</w:t>
+      </w:r>
+    </w:p>
+    <w:p>
+      <w:pPr/>
+      <w:r>
+        <w:rPr>
+          <w:rFonts w:ascii="Helvetica Light" w:hAnsi="Helvetica Light" w:cs="Helvetica Light"/>
+          <w:sz w:val="24"/>
+          <w:sz-cs w:val="24"/>
+        </w:rPr>
+        <w:t xml:space="preserve">- Frontend inbox template composer:</w:t>
+      </w:r>
+    </w:p>
+    <w:p>
+      <w:pPr/>
+      <w:r>
+        <w:rPr>
+          <w:rFonts w:ascii="Helvetica Light" w:hAnsi="Helvetica Light" w:cs="Helvetica Light"/>
+          <w:sz w:val="24"/>
+          <w:sz-cs w:val="24"/>
+        </w:rPr>
+        <w:t xml:space="preserve">  - added auto-fill system variables button.</w:t>
+      </w:r>
+    </w:p>
+    <w:p>
+      <w:pPr/>
+      <w:r>
+        <w:rPr>
+          <w:rFonts w:ascii="Helvetica Light" w:hAnsi="Helvetica Light" w:cs="Helvetica Light"/>
+          <w:sz w:val="24"/>
+          <w:sz-cs w:val="24"/>
+        </w:rPr>
+        <w:t xml:space="preserve">  - added per-variable system token picker.</w:t>
+      </w:r>
+    </w:p>
+    <w:p>
+      <w:pPr/>
+      <w:r>
+        <w:rPr>
+          <w:rFonts w:ascii="Helvetica Light" w:hAnsi="Helvetica Light" w:cs="Helvetica Light"/>
+          <w:sz w:val="24"/>
+          <w:sz-cs w:val="24"/>
+        </w:rPr>
+        <w:t xml:space="preserve">  - preview resolves token markers using preset values.</w:t>
+      </w:r>
+    </w:p>
+    <w:p>
+      <w:pPr/>
+      <w:r>
+        <w:rPr>
+          <w:rFonts w:ascii="Helvetica Light" w:hAnsi="Helvetica Light" w:cs="Helvetica Light"/>
+          <w:sz w:val="24"/>
+          <w:sz-cs w:val="24"/>
+        </w:rPr>
+        <w:t xml:space="preserve">Update: 2026-02-25 (Template UX + shared library + media header)</w:t>
+      </w:r>
+    </w:p>
+    <w:p>
+      <w:pPr/>
+      <w:r>
+        <w:rPr>
+          <w:rFonts w:ascii="Helvetica Light" w:hAnsi="Helvetica Light" w:cs="Helvetica Light"/>
+          <w:sz w:val="24"/>
+          <w:sz-cs w:val="24"/>
+        </w:rPr>
+        <w:t xml:space="preserve">- Templates UI now has live WhatsApp-style preview (create dialog + list-row preview action).</w:t>
+      </w:r>
+    </w:p>
+    <w:p>
+      <w:pPr/>
+      <w:r>
+        <w:rPr>
+          <w:rFonts w:ascii="Helvetica Light" w:hAnsi="Helvetica Light" w:cs="Helvetica Light"/>
+          <w:sz w:val="24"/>
+          <w:sz-cs w:val="24"/>
+        </w:rPr>
+        <w:t xml:space="preserve">- Added media header support in template creation:</w:t>
+      </w:r>
+    </w:p>
+    <w:p>
+      <w:pPr/>
+      <w:r>
+        <w:rPr>
+          <w:rFonts w:ascii="Helvetica Light" w:hAnsi="Helvetica Light" w:cs="Helvetica Light"/>
+          <w:sz w:val="24"/>
+          <w:sz-cs w:val="24"/>
+        </w:rPr>
+        <w:t xml:space="preserve">  - Header type image/video/document now shows upload control.</w:t>
+      </w:r>
+    </w:p>
+    <w:p>
+      <w:pPr/>
+      <w:r>
+        <w:rPr>
+          <w:rFonts w:ascii="Helvetica Light" w:hAnsi="Helvetica Light" w:cs="Helvetica Light"/>
+          <w:sz w:val="24"/>
+          <w:sz-cs w:val="24"/>
+        </w:rPr>
+        <w:t xml:space="preserve">  - Upload API added: POST /api/messages/upload-whatsapp-asset (uploads to WhatsApp, returns mediaId).</w:t>
+      </w:r>
+    </w:p>
+    <w:p>
+      <w:pPr/>
+      <w:r>
+        <w:rPr>
+          <w:rFonts w:ascii="Helvetica Light" w:hAnsi="Helvetica Light" w:cs="Helvetica Light"/>
+          <w:sz w:val="24"/>
+          <w:sz-cs w:val="24"/>
+        </w:rPr>
+        <w:t xml:space="preserve">  - Template stores HeaderMediaId/HeaderMediaName.</w:t>
+      </w:r>
+    </w:p>
+    <w:p>
+      <w:pPr/>
+      <w:r>
+        <w:rPr>
+          <w:rFonts w:ascii="Helvetica Light" w:hAnsi="Helvetica Light" w:cs="Helvetica Light"/>
+          <w:sz w:val="24"/>
+          <w:sz-cs w:val="24"/>
+        </w:rPr>
+        <w:t xml:space="preserve">- Added category guidance + stricter validation hints (especially Authentication category).</w:t>
+      </w:r>
+    </w:p>
+    <w:p>
+      <w:pPr/>
+      <w:r>
+        <w:rPr>
+          <w:rFonts w:ascii="Helvetica Light" w:hAnsi="Helvetica Light" w:cs="Helvetica Light"/>
+          <w:sz w:val="24"/>
+          <w:sz-cs w:val="24"/>
+        </w:rPr>
+        <w:t xml:space="preserve">- Added shared template library (DB-backed, visible across projects/users):</w:t>
+      </w:r>
+    </w:p>
+    <w:p>
+      <w:pPr/>
+      <w:r>
+        <w:rPr>
+          <w:rFonts w:ascii="Helvetica Light" w:hAnsi="Helvetica Light" w:cs="Helvetica Light"/>
+          <w:sz w:val="24"/>
+          <w:sz-cs w:val="24"/>
+        </w:rPr>
+        <w:t xml:space="preserve">  - GET /api/templates/library</w:t>
+      </w:r>
+    </w:p>
+    <w:p>
+      <w:pPr/>
+      <w:r>
+        <w:rPr>
+          <w:rFonts w:ascii="Helvetica Light" w:hAnsi="Helvetica Light" w:cs="Helvetica Light"/>
+          <w:sz w:val="24"/>
+          <w:sz-cs w:val="24"/>
+        </w:rPr>
+        <w:t xml:space="preserve">  - POST /api/templates/library/sync (sync from Meta/account templates into shared DB library)</w:t>
+      </w:r>
+    </w:p>
+    <w:p>
+      <w:pPr/>
+      <w:r>
+        <w:rPr>
+          <w:rFonts w:ascii="Helvetica Light" w:hAnsi="Helvetica Light" w:cs="Helvetica Light"/>
+          <w:sz w:val="24"/>
+          <w:sz-cs w:val="24"/>
+        </w:rPr>
+        <w:t xml:space="preserve">  - Library UI with search/filter and "Use template" prefill flow.</w:t>
+      </w:r>
+    </w:p>
+    <w:p>
+      <w:pPr/>
+      <w:r>
+        <w:rPr>
+          <w:rFonts w:ascii="Helvetica Light" w:hAnsi="Helvetica Light" w:cs="Helvetica Light"/>
+          <w:sz w:val="24"/>
+          <w:sz-cs w:val="24"/>
+        </w:rPr>
+        <w:t xml:space="preserve">- Meta template submit composer now carries media header example handle when HeaderMediaId is set.</w:t>
       </w:r>
     </w:p>
     <w:sectPr/>

</xml_diff>